<commit_message>
update template.docx with revised SHTKA note
</commit_message>
<xml_diff>
--- a/template.docx
+++ b/template.docx
@@ -55,7 +55,6 @@
           <w:rtl w:val="0"/>
         </w:rPr>
         <w:br w:type="textWrapping"/>
-        <w:br w:type="textWrapping"/>
       </w:r>
       <w:r>
         <w:rPr>
@@ -75,12 +74,12 @@
             <wp:extent cx="7937914" cy="10694504"/>
             <wp:effectExtent b="0" l="0" r="0" t="0"/>
             <wp:wrapNone/>
-            <wp:docPr descr="C:\Users\HP\AppData\Local\Microsoft\Windows\INetCache\Content.Word\Scan Kop Surat.jpg" id="2" name="image1.jpg"/>
+            <wp:docPr descr="C:\Users\HP\AppData\Local\Microsoft\Windows\INetCache\Content.Word\Scan Kop Surat.jpg" id="2" name="image2.jpg"/>
             <a:graphic>
               <a:graphicData uri="http://schemas.openxmlformats.org/drawingml/2006/picture">
                 <pic:pic>
                   <pic:nvPicPr>
-                    <pic:cNvPr descr="C:\Users\HP\AppData\Local\Microsoft\Windows\INetCache\Content.Word\Scan Kop Surat.jpg" id="0" name="image1.jpg"/>
+                    <pic:cNvPr descr="C:\Users\HP\AppData\Local\Microsoft\Windows\INetCache\Content.Word\Scan Kop Surat.jpg" id="0" name="image2.jpg"/>
                     <pic:cNvPicPr preferRelativeResize="0"/>
                   </pic:nvPicPr>
                   <pic:blipFill>
@@ -121,7 +120,7 @@
         <w:shd w:fill="auto" w:val="clear"/>
         <w:spacing w:after="0" w:before="0" w:line="240" w:lineRule="auto"/>
         <w:ind w:left="0" w:right="0" w:firstLine="0"/>
-        <w:jc w:val="center"/>
+        <w:jc w:val="left"/>
         <w:rPr>
           <w:rFonts w:ascii="Times New Roman" w:cs="Times New Roman" w:eastAsia="Times New Roman" w:hAnsi="Times New Roman"/>
           <w:b w:val="1"/>
@@ -158,9 +157,9 @@
           <w:between w:space="0" w:sz="0" w:val="nil"/>
         </w:pBdr>
         <w:shd w:fill="auto" w:val="clear"/>
-        <w:spacing w:after="0" w:before="0" w:line="240" w:lineRule="auto"/>
+        <w:spacing w:after="0" w:before="0" w:line="276" w:lineRule="auto"/>
         <w:ind w:left="0" w:right="0" w:firstLine="0"/>
-        <w:jc w:val="left"/>
+        <w:jc w:val="center"/>
         <w:rPr>
           <w:rFonts w:ascii="Times New Roman" w:cs="Times New Roman" w:eastAsia="Times New Roman" w:hAnsi="Times New Roman"/>
           <w:b w:val="1"/>
@@ -175,6 +174,101 @@
           <w:u w:val="none"/>
           <w:shd w:fill="auto" w:val="clear"/>
           <w:vertAlign w:val="baseline"/>
+        </w:rPr>
+      </w:pPr>
+      <w:bookmarkStart w:colFirst="0" w:colLast="0" w:name="_cdiq5eo0o3a0" w:id="1"/>
+      <w:bookmarkEnd w:id="1"/>
+      <w:r>
+        <w:rPr>
+          <w:rFonts w:ascii="Times New Roman" w:cs="Times New Roman" w:eastAsia="Times New Roman" w:hAnsi="Times New Roman"/>
+          <w:b w:val="1"/>
+          <w:bCs w:val="1"/>
+          <w:sz w:val="28"/>
+          <w:szCs w:val="28"/>
+          <w:rtl w:val="0"/>
+        </w:rPr>
+        <w:t xml:space="preserve">SURAT KETERANGAN </w:t>
+      </w:r>
+      <w:r>
+        <w:rPr>
+          <w:rFonts w:ascii="Times New Roman" w:cs="Times New Roman" w:eastAsia="Times New Roman" w:hAnsi="Times New Roman"/>
+          <w:b w:val="1"/>
+          <w:bCs w:val="1"/>
+          <w:i w:val="0"/>
+          <w:iCs w:val="0"/>
+          <w:smallCaps w:val="0"/>
+          <w:strike w:val="0"/>
+          <w:color w:val="000000"/>
+          <w:sz w:val="28"/>
+          <w:szCs w:val="28"/>
+          <w:u w:val="none"/>
+          <w:shd w:fill="auto" w:val="clear"/>
+          <w:vertAlign w:val="baseline"/>
+          <w:rtl w:val="0"/>
+        </w:rPr>
+        <w:t xml:space="preserve">HASIL TES KEMAMPUAN AKADEMIK</w:t>
+      </w:r>
+    </w:p>
+    <w:p>
+      <w:pPr>
+        <w:keepNext w:val="0"/>
+        <w:keepLines w:val="0"/>
+        <w:pageBreakBefore w:val="0"/>
+        <w:widowControl w:val="1"/>
+        <w:pBdr>
+          <w:top w:space="0" w:sz="0" w:val="nil"/>
+          <w:left w:space="0" w:sz="0" w:val="nil"/>
+          <w:bottom w:space="0" w:sz="0" w:val="nil"/>
+          <w:right w:space="0" w:sz="0" w:val="nil"/>
+          <w:between w:space="0" w:sz="0" w:val="nil"/>
+        </w:pBdr>
+        <w:shd w:fill="auto" w:val="clear"/>
+        <w:spacing w:after="0" w:before="0" w:line="276" w:lineRule="auto"/>
+        <w:ind w:left="0" w:right="0" w:firstLine="0"/>
+        <w:jc w:val="center"/>
+        <w:rPr>
+          <w:rFonts w:ascii="Times New Roman" w:cs="Times New Roman" w:eastAsia="Times New Roman" w:hAnsi="Times New Roman"/>
+          <w:b w:val="1"/>
+          <w:bCs w:val="1"/>
+          <w:sz w:val="28"/>
+          <w:szCs w:val="28"/>
+        </w:rPr>
+      </w:pPr>
+      <w:r>
+        <w:rPr>
+          <w:rFonts w:ascii="Times New Roman" w:cs="Times New Roman" w:eastAsia="Times New Roman" w:hAnsi="Times New Roman"/>
+          <w:b w:val="1"/>
+          <w:bCs w:val="1"/>
+          <w:sz w:val="28"/>
+          <w:szCs w:val="28"/>
+          <w:rtl w:val="0"/>
+        </w:rPr>
+        <w:t xml:space="preserve">Nomor : 832/MIS-SMP/B/SKT/VI/2026</w:t>
+      </w:r>
+    </w:p>
+    <w:p>
+      <w:pPr>
+        <w:keepNext w:val="0"/>
+        <w:keepLines w:val="0"/>
+        <w:pageBreakBefore w:val="0"/>
+        <w:widowControl w:val="1"/>
+        <w:pBdr>
+          <w:top w:space="0" w:sz="0" w:val="nil"/>
+          <w:left w:space="0" w:sz="0" w:val="nil"/>
+          <w:bottom w:space="0" w:sz="0" w:val="nil"/>
+          <w:right w:space="0" w:sz="0" w:val="nil"/>
+          <w:between w:space="0" w:sz="0" w:val="nil"/>
+        </w:pBdr>
+        <w:shd w:fill="auto" w:val="clear"/>
+        <w:spacing w:after="0" w:before="0" w:line="276" w:lineRule="auto"/>
+        <w:ind w:left="0" w:right="0" w:firstLine="0"/>
+        <w:jc w:val="center"/>
+        <w:rPr>
+          <w:rFonts w:ascii="Times New Roman" w:cs="Times New Roman" w:eastAsia="Times New Roman" w:hAnsi="Times New Roman"/>
+          <w:b w:val="1"/>
+          <w:bCs w:val="1"/>
+          <w:sz w:val="28"/>
+          <w:szCs w:val="28"/>
         </w:rPr>
       </w:pPr>
       <w:r>
@@ -199,43 +293,21 @@
         <w:shd w:fill="auto" w:val="clear"/>
         <w:spacing w:after="0" w:before="0" w:line="360" w:lineRule="auto"/>
         <w:ind w:left="0" w:right="0" w:firstLine="0"/>
-        <w:jc w:val="center"/>
-        <w:rPr>
-          <w:rFonts w:ascii="Times New Roman" w:cs="Times New Roman" w:eastAsia="Times New Roman" w:hAnsi="Times New Roman"/>
-          <w:b w:val="1"/>
-          <w:bCs w:val="1"/>
-          <w:i w:val="0"/>
-          <w:iCs w:val="0"/>
-          <w:smallCaps w:val="0"/>
-          <w:strike w:val="0"/>
-          <w:color w:val="000000"/>
-          <w:sz w:val="28"/>
-          <w:szCs w:val="28"/>
-          <w:u w:val="none"/>
-          <w:shd w:fill="auto" w:val="clear"/>
-          <w:vertAlign w:val="baseline"/>
-        </w:rPr>
-      </w:pPr>
-      <w:bookmarkStart w:colFirst="0" w:colLast="0" w:name="_cdiq5eo0o3a0" w:id="1"/>
-      <w:bookmarkEnd w:id="1"/>
-      <w:r>
-        <w:rPr>
-          <w:rFonts w:ascii="Times New Roman" w:cs="Times New Roman" w:eastAsia="Times New Roman" w:hAnsi="Times New Roman"/>
-          <w:b w:val="1"/>
-          <w:bCs w:val="1"/>
-          <w:i w:val="0"/>
-          <w:iCs w:val="0"/>
-          <w:smallCaps w:val="0"/>
-          <w:strike w:val="0"/>
-          <w:color w:val="000000"/>
-          <w:sz w:val="28"/>
-          <w:szCs w:val="28"/>
-          <w:u w:val="none"/>
-          <w:shd w:fill="auto" w:val="clear"/>
-          <w:vertAlign w:val="baseline"/>
-          <w:rtl w:val="0"/>
-        </w:rPr>
-        <w:t xml:space="preserve">HASIL TES KEMAMPUAN AKADEMIK</w:t>
+        <w:jc w:val="both"/>
+        <w:rPr>
+          <w:rFonts w:ascii="Times New Roman" w:cs="Times New Roman" w:eastAsia="Times New Roman" w:hAnsi="Times New Roman"/>
+          <w:sz w:val="24"/>
+          <w:szCs w:val="24"/>
+        </w:rPr>
+      </w:pPr>
+      <w:r>
+        <w:rPr>
+          <w:rFonts w:ascii="Times New Roman" w:cs="Times New Roman" w:eastAsia="Times New Roman" w:hAnsi="Times New Roman"/>
+          <w:sz w:val="24"/>
+          <w:szCs w:val="24"/>
+          <w:rtl w:val="0"/>
+        </w:rPr>
+        <w:t xml:space="preserve">Yang bertanda tangan di bawah ini : </w:t>
       </w:r>
     </w:p>
     <w:p>
@@ -254,66 +326,131 @@
         <w:shd w:fill="auto" w:val="clear"/>
         <w:spacing w:after="0" w:before="0" w:line="360" w:lineRule="auto"/>
         <w:ind w:left="0" w:right="0" w:firstLine="0"/>
-        <w:jc w:val="center"/>
-        <w:rPr>
-          <w:rFonts w:ascii="Times New Roman" w:cs="Times New Roman" w:eastAsia="Times New Roman" w:hAnsi="Times New Roman"/>
-          <w:b w:val="1"/>
-          <w:bCs w:val="1"/>
-          <w:i w:val="0"/>
-          <w:iCs w:val="0"/>
-          <w:smallCaps w:val="0"/>
-          <w:strike w:val="0"/>
-          <w:color w:val="000000"/>
-          <w:sz w:val="28"/>
-          <w:szCs w:val="28"/>
-          <w:u w:val="none"/>
-          <w:shd w:fill="auto" w:val="clear"/>
-          <w:vertAlign w:val="baseline"/>
-        </w:rPr>
-      </w:pPr>
-      <w:r>
-        <w:rPr>
-          <w:rFonts w:ascii="Times New Roman" w:cs="Times New Roman" w:eastAsia="Times New Roman" w:hAnsi="Times New Roman"/>
-          <w:b w:val="1"/>
-          <w:bCs w:val="1"/>
-          <w:i w:val="0"/>
-          <w:iCs w:val="0"/>
-          <w:smallCaps w:val="0"/>
-          <w:strike w:val="0"/>
-          <w:color w:val="000000"/>
-          <w:sz w:val="28"/>
-          <w:szCs w:val="28"/>
-          <w:u w:val="none"/>
-          <w:shd w:fill="auto" w:val="clear"/>
-          <w:vertAlign w:val="baseline"/>
-          <w:rtl w:val="0"/>
-        </w:rPr>
-        <w:t xml:space="preserve">TAHUN PELAJARAN 2025/2026</w:t>
-      </w:r>
-      <w:r>
-        <w:rPr>
-          <w:rFonts w:ascii="Times New Roman" w:cs="Times New Roman" w:eastAsia="Times New Roman" w:hAnsi="Times New Roman"/>
-          <w:b w:val="0"/>
-          <w:bCs w:val="0"/>
-          <w:i w:val="0"/>
-          <w:iCs w:val="0"/>
-          <w:smallCaps w:val="0"/>
-          <w:strike w:val="0"/>
-          <w:color w:val="000000"/>
-          <w:sz w:val="32"/>
-          <w:szCs w:val="32"/>
-          <w:u w:val="none"/>
-          <w:shd w:fill="auto" w:val="clear"/>
-          <w:vertAlign w:val="baseline"/>
-          <w:rtl w:val="0"/>
-        </w:rPr>
-        <w:br w:type="textWrapping"/>
+        <w:jc w:val="both"/>
+        <w:rPr>
+          <w:rFonts w:ascii="Times New Roman" w:cs="Times New Roman" w:eastAsia="Times New Roman" w:hAnsi="Times New Roman"/>
+          <w:sz w:val="24"/>
+          <w:szCs w:val="24"/>
+        </w:rPr>
+      </w:pPr>
+      <w:r>
+        <w:rPr>
+          <w:rFonts w:ascii="Times New Roman" w:cs="Times New Roman" w:eastAsia="Times New Roman" w:hAnsi="Times New Roman"/>
+          <w:sz w:val="24"/>
+          <w:szCs w:val="24"/>
+          <w:rtl w:val="0"/>
+        </w:rPr>
+        <w:t xml:space="preserve">Nama </w:t>
+        <w:tab/>
+        <w:tab/>
+        <w:tab/>
+        <w:tab/>
+        <w:t xml:space="preserve">: Khalimi, </w:t>
+      </w:r>
+      <w:r>
+        <w:rPr>
+          <w:rFonts w:ascii="Times New Roman" w:cs="Times New Roman" w:eastAsia="Times New Roman" w:hAnsi="Times New Roman"/>
+          <w:sz w:val="24"/>
+          <w:szCs w:val="24"/>
+          <w:rtl w:val="0"/>
+        </w:rPr>
+        <w:t xml:space="preserve">M.Pd</w:t>
+      </w:r>
+      <w:r>
+        <w:rPr>
+          <w:rtl w:val="0"/>
+        </w:rPr>
+      </w:r>
+    </w:p>
+    <w:p>
+      <w:pPr>
+        <w:keepNext w:val="0"/>
+        <w:keepLines w:val="0"/>
+        <w:pageBreakBefore w:val="0"/>
+        <w:widowControl w:val="1"/>
+        <w:pBdr>
+          <w:top w:space="0" w:sz="0" w:val="nil"/>
+          <w:left w:space="0" w:sz="0" w:val="nil"/>
+          <w:bottom w:space="0" w:sz="0" w:val="nil"/>
+          <w:right w:space="0" w:sz="0" w:val="nil"/>
+          <w:between w:space="0" w:sz="0" w:val="nil"/>
+        </w:pBdr>
+        <w:shd w:fill="auto" w:val="clear"/>
+        <w:spacing w:after="0" w:before="0" w:line="360" w:lineRule="auto"/>
+        <w:ind w:left="0" w:right="0" w:firstLine="0"/>
+        <w:jc w:val="both"/>
+        <w:rPr>
+          <w:rFonts w:ascii="Times New Roman" w:cs="Times New Roman" w:eastAsia="Times New Roman" w:hAnsi="Times New Roman"/>
+          <w:sz w:val="24"/>
+          <w:szCs w:val="24"/>
+        </w:rPr>
+      </w:pPr>
+      <w:r>
+        <w:rPr>
+          <w:rFonts w:ascii="Times New Roman" w:cs="Times New Roman" w:eastAsia="Times New Roman" w:hAnsi="Times New Roman"/>
+          <w:sz w:val="24"/>
+          <w:szCs w:val="24"/>
+          <w:rtl w:val="0"/>
+        </w:rPr>
+        <w:t xml:space="preserve">Jabatan</w:t>
+        <w:tab/>
+        <w:tab/>
+        <w:tab/>
+        <w:tab/>
+        <w:t xml:space="preserve">: Kepala SMP Mumtaza Islamic School</w:t>
+      </w:r>
+    </w:p>
+    <w:p>
+      <w:pPr>
+        <w:keepNext w:val="0"/>
+        <w:keepLines w:val="0"/>
+        <w:pageBreakBefore w:val="0"/>
+        <w:widowControl w:val="1"/>
+        <w:pBdr>
+          <w:top w:space="0" w:sz="0" w:val="nil"/>
+          <w:left w:space="0" w:sz="0" w:val="nil"/>
+          <w:bottom w:space="0" w:sz="0" w:val="nil"/>
+          <w:right w:space="0" w:sz="0" w:val="nil"/>
+          <w:between w:space="0" w:sz="0" w:val="nil"/>
+        </w:pBdr>
+        <w:shd w:fill="auto" w:val="clear"/>
+        <w:spacing w:after="0" w:before="0" w:line="360" w:lineRule="auto"/>
+        <w:ind w:left="2880" w:right="0" w:hanging="2880"/>
+        <w:jc w:val="both"/>
+        <w:rPr>
+          <w:rFonts w:ascii="Times New Roman" w:cs="Times New Roman" w:eastAsia="Times New Roman" w:hAnsi="Times New Roman"/>
+          <w:sz w:val="24"/>
+          <w:szCs w:val="24"/>
+        </w:rPr>
+      </w:pPr>
+      <w:r>
+        <w:rPr>
+          <w:rFonts w:ascii="Times New Roman" w:cs="Times New Roman" w:eastAsia="Times New Roman" w:hAnsi="Times New Roman"/>
+          <w:sz w:val="24"/>
+          <w:szCs w:val="24"/>
+          <w:rtl w:val="0"/>
+        </w:rPr>
+        <w:t xml:space="preserve">Alamat Sekolah </w:t>
+        <w:tab/>
+        <w:t xml:space="preserve">: </w:t>
+      </w:r>
+      <w:r>
+        <w:rPr>
+          <w:rFonts w:ascii="Times New Roman" w:cs="Times New Roman" w:eastAsia="Times New Roman" w:hAnsi="Times New Roman"/>
+          <w:sz w:val="24"/>
+          <w:szCs w:val="24"/>
+          <w:rtl w:val="0"/>
+        </w:rPr>
+        <w:t xml:space="preserve">Jl. Kayu Manis 2 No.11 RT 01 RW 02. Pondok Cabe Udik, Pamulang, Tangerang Selatan 15417</w:t>
+      </w:r>
+      <w:r>
+        <w:rPr>
+          <w:rFonts w:ascii="Times New Roman" w:cs="Times New Roman" w:eastAsia="Times New Roman" w:hAnsi="Times New Roman"/>
+          <w:sz w:val="24"/>
+          <w:szCs w:val="24"/>
+          <w:rtl w:val="0"/>
+        </w:rPr>
         <w:t xml:space="preserve"> </w:t>
-      </w:r>
-      <w:r>
-        <w:rPr>
-          <w:rtl w:val="0"/>
-        </w:rPr>
       </w:r>
     </w:p>
     <w:p>
@@ -333,7 +470,46 @@
         <w:tabs>
           <w:tab w:val="left" w:leader="none" w:pos="-450"/>
         </w:tabs>
-        <w:spacing w:after="160" w:before="0" w:line="360" w:lineRule="auto"/>
+        <w:spacing w:after="0" w:before="0" w:line="360" w:lineRule="auto"/>
+        <w:ind w:left="-540" w:right="-604" w:firstLine="0"/>
+        <w:rPr>
+          <w:rFonts w:ascii="Times New Roman" w:cs="Times New Roman" w:eastAsia="Times New Roman" w:hAnsi="Times New Roman"/>
+          <w:sz w:val="24"/>
+          <w:szCs w:val="24"/>
+        </w:rPr>
+      </w:pPr>
+      <w:r>
+        <w:rPr>
+          <w:rFonts w:ascii="Times New Roman" w:cs="Times New Roman" w:eastAsia="Times New Roman" w:hAnsi="Times New Roman"/>
+          <w:sz w:val="24"/>
+          <w:szCs w:val="24"/>
+          <w:rtl w:val="0"/>
+        </w:rPr>
+        <w:tab/>
+        <w:tab/>
+        <w:t xml:space="preserve">Menerangkan bahwa nama di bawah ini : </w:t>
+        <w:tab/>
+        <w:tab/>
+      </w:r>
+    </w:p>
+    <w:p>
+      <w:pPr>
+        <w:keepNext w:val="0"/>
+        <w:keepLines w:val="0"/>
+        <w:pageBreakBefore w:val="0"/>
+        <w:widowControl w:val="1"/>
+        <w:pBdr>
+          <w:top w:space="0" w:sz="0" w:val="nil"/>
+          <w:left w:space="0" w:sz="0" w:val="nil"/>
+          <w:bottom w:space="0" w:sz="0" w:val="nil"/>
+          <w:right w:space="0" w:sz="0" w:val="nil"/>
+          <w:between w:space="0" w:sz="0" w:val="nil"/>
+        </w:pBdr>
+        <w:shd w:fill="auto" w:val="clear"/>
+        <w:tabs>
+          <w:tab w:val="left" w:leader="none" w:pos="-450"/>
+        </w:tabs>
+        <w:spacing w:after="0" w:before="0" w:line="360" w:lineRule="auto"/>
         <w:ind w:left="-540" w:right="-604" w:firstLine="0"/>
         <w:rPr>
           <w:rFonts w:ascii="Times New Roman" w:cs="Times New Roman" w:eastAsia="Times New Roman" w:hAnsi="Times New Roman"/>
@@ -379,6 +555,8 @@
         <w:rPr>
           <w:b w:val="1"/>
           <w:bCs w:val="1"/>
+          <w:sz w:val="24"/>
+          <w:szCs w:val="24"/>
           <w:rtl w:val="0"/>
         </w:rPr>
         <w:t xml:space="preserve">Nama</w:t>
@@ -427,6 +605,8 @@
         <w:rPr>
           <w:b w:val="1"/>
           <w:bCs w:val="1"/>
+          <w:sz w:val="24"/>
+          <w:szCs w:val="24"/>
           <w:rtl w:val="0"/>
         </w:rPr>
         <w:t xml:space="preserve">Tempat_Tanggal_Lahir</w:t>
@@ -538,6 +718,8 @@
         <w:rPr>
           <w:b w:val="1"/>
           <w:bCs w:val="1"/>
+          <w:sz w:val="24"/>
+          <w:szCs w:val="24"/>
           <w:rtl w:val="0"/>
         </w:rPr>
         <w:t xml:space="preserve">Nomor_Peserta</w:t>
@@ -554,7 +736,7 @@
     </w:p>
     <w:p>
       <w:pPr>
-        <w:spacing w:after="0" w:line="360" w:lineRule="auto"/>
+        <w:spacing w:after="0" w:line="240" w:lineRule="auto"/>
         <w:rPr>
           <w:rFonts w:ascii="Times New Roman" w:cs="Times New Roman" w:eastAsia="Times New Roman" w:hAnsi="Times New Roman"/>
           <w:sz w:val="24"/>
@@ -584,7 +766,7 @@
         <w:tabs>
           <w:tab w:val="left" w:leader="none" w:pos="5910"/>
         </w:tabs>
-        <w:spacing w:after="160" w:before="0" w:line="360" w:lineRule="auto"/>
+        <w:spacing w:after="0" w:before="0" w:line="360" w:lineRule="auto"/>
         <w:ind w:left="-540" w:right="-600" w:firstLine="0"/>
         <w:jc w:val="both"/>
         <w:rPr>
@@ -600,75 +782,35 @@
           <w:szCs w:val="24"/>
           <w:rtl w:val="0"/>
         </w:rPr>
-        <w:t xml:space="preserve">Berdasarkan hasil verifikasi oleh pihak sekolah pada data resmi yang disampaikan oleh  </w:t>
-      </w:r>
-      <w:r>
-        <w:rPr>
-          <w:rFonts w:ascii="Times New Roman" w:cs="Times New Roman" w:eastAsia="Times New Roman" w:hAnsi="Times New Roman"/>
-          <w:b w:val="1"/>
-          <w:bCs w:val="1"/>
-          <w:sz w:val="24"/>
-          <w:szCs w:val="24"/>
-          <w:rtl w:val="0"/>
-        </w:rPr>
-        <w:t xml:space="preserve">Dinas Pendidikan Kota Tangerang Selatan,</w:t>
-      </w:r>
-      <w:r>
-        <w:rPr>
-          <w:rFonts w:ascii="Times New Roman" w:cs="Times New Roman" w:eastAsia="Times New Roman" w:hAnsi="Times New Roman"/>
-          <w:sz w:val="24"/>
-          <w:szCs w:val="24"/>
-          <w:rtl w:val="0"/>
-        </w:rPr>
-        <w:t xml:space="preserve"> dengan ini kami sampaikan </w:t>
-      </w:r>
-      <w:r>
-        <w:rPr>
-          <w:rFonts w:ascii="Times New Roman" w:cs="Times New Roman" w:eastAsia="Times New Roman" w:hAnsi="Times New Roman"/>
-          <w:b w:val="1"/>
-          <w:bCs w:val="1"/>
-          <w:sz w:val="24"/>
-          <w:szCs w:val="24"/>
-          <w:rtl w:val="0"/>
-        </w:rPr>
-        <w:t xml:space="preserve">Hasil Tes Kemampuan Akademik (TKA)</w:t>
-      </w:r>
-      <w:r>
-        <w:rPr>
-          <w:rFonts w:ascii="Times New Roman" w:cs="Times New Roman" w:eastAsia="Times New Roman" w:hAnsi="Times New Roman"/>
-          <w:sz w:val="24"/>
-          <w:szCs w:val="24"/>
-          <w:rtl w:val="0"/>
-        </w:rPr>
-        <w:t xml:space="preserve"> sebagai berikut : </w:t>
+        <w:t xml:space="preserve">Telah mengikuti Tes Kemampuan Akademik (TKA) Tahun Pelajaran 2025/2026 dengan hasil sebagai berikut : </w:t>
       </w:r>
     </w:p>
     <w:tbl>
       <w:tblPr>
         <w:tblStyle w:val="Table1"/>
-        <w:tblW w:w="9634.0" w:type="dxa"/>
+        <w:tblW w:w="9705.0" w:type="dxa"/>
         <w:jc w:val="center"/>
         <w:tblLayout w:type="fixed"/>
         <w:tblLook w:val="0400"/>
       </w:tblPr>
       <w:tblGrid>
-        <w:gridCol w:w="742"/>
-        <w:gridCol w:w="2278"/>
-        <w:gridCol w:w="3266"/>
-        <w:gridCol w:w="3348"/>
+        <w:gridCol w:w="735"/>
+        <w:gridCol w:w="2295"/>
+        <w:gridCol w:w="3300"/>
+        <w:gridCol w:w="3375"/>
         <w:tblGridChange w:id="0">
           <w:tblGrid>
-            <w:gridCol w:w="742"/>
-            <w:gridCol w:w="2278"/>
-            <w:gridCol w:w="3266"/>
-            <w:gridCol w:w="3348"/>
+            <w:gridCol w:w="735"/>
+            <w:gridCol w:w="2295"/>
+            <w:gridCol w:w="3300"/>
+            <w:gridCol w:w="3375"/>
           </w:tblGrid>
         </w:tblGridChange>
       </w:tblGrid>
       <w:tr>
         <w:trPr>
           <w:cantSplit w:val="0"/>
-          <w:trHeight w:val="720" w:hRule="atLeast"/>
+          <w:trHeight w:val="555" w:hRule="atLeast"/>
           <w:tblHeader w:val="0"/>
         </w:trPr>
         <w:tc>
@@ -858,7 +1000,7 @@
       <w:tr>
         <w:trPr>
           <w:cantSplit w:val="0"/>
-          <w:trHeight w:val="720" w:hRule="atLeast"/>
+          <w:trHeight w:val="585" w:hRule="atLeast"/>
           <w:tblHeader w:val="0"/>
         </w:trPr>
         <w:tc>
@@ -980,26 +1122,7 @@
                 <w:szCs w:val="24"/>
                 <w:rtl w:val="0"/>
               </w:rPr>
-              <w:t xml:space="preserve">&lt;&lt;</w:t>
-            </w:r>
-            <w:r>
-              <w:rPr>
-                <w:b w:val="1"/>
-                <w:bCs w:val="1"/>
-                <w:rtl w:val="0"/>
-              </w:rPr>
-              <w:t xml:space="preserve">Matematika_Score</w:t>
-            </w:r>
-            <w:r>
-              <w:rPr>
-                <w:rFonts w:ascii="Times New Roman" w:cs="Times New Roman" w:eastAsia="Times New Roman" w:hAnsi="Times New Roman"/>
-                <w:b w:val="1"/>
-                <w:bCs w:val="1"/>
-                <w:sz w:val="24"/>
-                <w:szCs w:val="24"/>
-                <w:rtl w:val="0"/>
-              </w:rPr>
-              <w:t xml:space="preserve"> &gt;&gt;</w:t>
+              <w:t xml:space="preserve">&lt;&lt;Matematika_Score &gt;&gt;</w:t>
             </w:r>
           </w:p>
         </w:tc>
@@ -1040,26 +1163,7 @@
                 <w:szCs w:val="24"/>
                 <w:rtl w:val="0"/>
               </w:rPr>
-              <w:t xml:space="preserve">&lt;&lt;</w:t>
-            </w:r>
-            <w:r>
-              <w:rPr>
-                <w:b w:val="1"/>
-                <w:bCs w:val="1"/>
-                <w:rtl w:val="0"/>
-              </w:rPr>
-              <w:t xml:space="preserve">Matematika_Rating</w:t>
-            </w:r>
-            <w:r>
-              <w:rPr>
-                <w:rFonts w:ascii="Times New Roman" w:cs="Times New Roman" w:eastAsia="Times New Roman" w:hAnsi="Times New Roman"/>
-                <w:b w:val="1"/>
-                <w:bCs w:val="1"/>
-                <w:sz w:val="24"/>
-                <w:szCs w:val="24"/>
-                <w:rtl w:val="0"/>
-              </w:rPr>
-              <w:t xml:space="preserve"> &gt;&gt;</w:t>
+              <w:t xml:space="preserve">&lt;&lt;Matematika_Rating &gt;&gt;</w:t>
             </w:r>
           </w:p>
         </w:tc>
@@ -1067,7 +1171,7 @@
       <w:tr>
         <w:trPr>
           <w:cantSplit w:val="0"/>
-          <w:trHeight w:val="720" w:hRule="atLeast"/>
+          <w:trHeight w:val="647.9296875" w:hRule="atLeast"/>
           <w:tblHeader w:val="0"/>
         </w:trPr>
         <w:tc>
@@ -1189,26 +1293,7 @@
                 <w:szCs w:val="24"/>
                 <w:rtl w:val="0"/>
               </w:rPr>
-              <w:t xml:space="preserve">&lt;&lt;</w:t>
-            </w:r>
-            <w:r>
-              <w:rPr>
-                <w:b w:val="1"/>
-                <w:bCs w:val="1"/>
-                <w:rtl w:val="0"/>
-              </w:rPr>
-              <w:t xml:space="preserve">Bahasa_Indonesia_Score</w:t>
-            </w:r>
-            <w:r>
-              <w:rPr>
-                <w:rFonts w:ascii="Times New Roman" w:cs="Times New Roman" w:eastAsia="Times New Roman" w:hAnsi="Times New Roman"/>
-                <w:b w:val="1"/>
-                <w:bCs w:val="1"/>
-                <w:sz w:val="24"/>
-                <w:szCs w:val="24"/>
-                <w:rtl w:val="0"/>
-              </w:rPr>
-              <w:t xml:space="preserve"> &gt;&gt;</w:t>
+              <w:t xml:space="preserve">&lt;&lt;Bahasa_Indonesia_Score &gt;&gt;</w:t>
             </w:r>
           </w:p>
         </w:tc>
@@ -1249,26 +1334,7 @@
                 <w:szCs w:val="24"/>
                 <w:rtl w:val="0"/>
               </w:rPr>
-              <w:t xml:space="preserve">&lt;&lt;</w:t>
-            </w:r>
-            <w:r>
-              <w:rPr>
-                <w:b w:val="1"/>
-                <w:bCs w:val="1"/>
-                <w:rtl w:val="0"/>
-              </w:rPr>
-              <w:t xml:space="preserve">Bahasa_Indonesia_Rating</w:t>
-            </w:r>
-            <w:r>
-              <w:rPr>
-                <w:rFonts w:ascii="Times New Roman" w:cs="Times New Roman" w:eastAsia="Times New Roman" w:hAnsi="Times New Roman"/>
-                <w:b w:val="1"/>
-                <w:bCs w:val="1"/>
-                <w:sz w:val="24"/>
-                <w:szCs w:val="24"/>
-                <w:rtl w:val="0"/>
-              </w:rPr>
-              <w:t xml:space="preserve"> &gt;&gt;</w:t>
+              <w:t xml:space="preserve">&lt;&lt;Bahasa_Indonesia_Rating &gt;&gt;</w:t>
             </w:r>
           </w:p>
         </w:tc>
@@ -1279,7 +1345,9 @@
         <w:tabs>
           <w:tab w:val="left" w:leader="none" w:pos="5910"/>
         </w:tabs>
-        <w:spacing w:line="360" w:lineRule="auto"/>
+        <w:spacing w:after="0" w:line="240" w:lineRule="auto"/>
+        <w:ind w:left="-540" w:right="-604" w:firstLine="0"/>
+        <w:jc w:val="both"/>
         <w:rPr>
           <w:rFonts w:ascii="Times New Roman" w:cs="Times New Roman" w:eastAsia="Times New Roman" w:hAnsi="Times New Roman"/>
           <w:sz w:val="24"/>
@@ -1297,7 +1365,7 @@
         <w:tabs>
           <w:tab w:val="left" w:leader="none" w:pos="5910"/>
         </w:tabs>
-        <w:spacing w:line="360" w:lineRule="auto"/>
+        <w:spacing w:after="0" w:line="360" w:lineRule="auto"/>
         <w:ind w:left="-540" w:right="-604" w:firstLine="0"/>
         <w:jc w:val="both"/>
         <w:rPr>
@@ -1313,63 +1381,27 @@
           <w:szCs w:val="24"/>
           <w:rtl w:val="0"/>
         </w:rPr>
-        <w:t xml:space="preserve">Catatan: Dokumen ini merupakan informasi sementara dari sekolah. Adapun </w:t>
-      </w:r>
-      <w:r>
-        <w:rPr>
-          <w:rFonts w:ascii="Times New Roman" w:cs="Times New Roman" w:eastAsia="Times New Roman" w:hAnsi="Times New Roman"/>
-          <w:b w:val="1"/>
-          <w:bCs w:val="1"/>
-          <w:sz w:val="24"/>
-          <w:szCs w:val="24"/>
-          <w:rtl w:val="0"/>
-        </w:rPr>
-        <w:t xml:space="preserve">Sertifikat Hasil Tes Kemampuan Akademik (SHTKA)</w:t>
-      </w:r>
-      <w:r>
-        <w:rPr>
-          <w:rFonts w:ascii="Times New Roman" w:cs="Times New Roman" w:eastAsia="Times New Roman" w:hAnsi="Times New Roman"/>
-          <w:sz w:val="24"/>
-          <w:szCs w:val="24"/>
-          <w:rtl w:val="0"/>
-        </w:rPr>
-        <w:t xml:space="preserve"> akan disampaikan lebih lanjut.</w:t>
-      </w:r>
-    </w:p>
-    <w:p>
-      <w:pPr>
-        <w:spacing w:after="0" w:lineRule="auto"/>
-        <w:ind w:left="5040" w:right="-450" w:firstLine="180"/>
-        <w:rPr>
-          <w:rFonts w:ascii="Times New Roman" w:cs="Times New Roman" w:eastAsia="Times New Roman" w:hAnsi="Times New Roman"/>
-          <w:sz w:val="24"/>
-          <w:szCs w:val="24"/>
-        </w:rPr>
-      </w:pPr>
-      <w:r>
-        <w:rPr>
-          <w:rtl w:val="0"/>
-        </w:rPr>
+        <w:t xml:space="preserve">Nilai tersebut berdasarkan Daftar Kolektif Hasil Tes Kemampuan Akademik (DKHTKA)  Dinas Pendidikan dan Kebudayaan Kota Tangerang Selatan Tahun 2026. Surat keterangan ini bersifat sementara sebagai bukti perolehan hasil TKA dan dapat digunakan untuk keperluan administrasi  yang diperlukan sebelum dokumen Sertifikat Hasil Tes Kemampuan Akademik (SHTKA) diterbitkan. </w:t>
       </w:r>
       <w:r>
         <w:drawing>
           <wp:anchor allowOverlap="1" behindDoc="1" distB="0" distT="0" distL="0" distR="0" hidden="0" layoutInCell="1" locked="0" relativeHeight="0" simplePos="0">
             <wp:simplePos x="0" y="0"/>
             <wp:positionH relativeFrom="column">
-              <wp:posOffset>2537460</wp:posOffset>
+              <wp:posOffset>2295525</wp:posOffset>
             </wp:positionH>
             <wp:positionV relativeFrom="paragraph">
-              <wp:posOffset>101600</wp:posOffset>
+              <wp:posOffset>1190625</wp:posOffset>
             </wp:positionV>
             <wp:extent cx="1413510" cy="1247775"/>
             <wp:effectExtent b="0" l="0" r="0" t="0"/>
             <wp:wrapNone/>
-            <wp:docPr id="1" name="image2.jpg"/>
+            <wp:docPr id="1" name="image1.jpg"/>
             <a:graphic>
               <a:graphicData uri="http://schemas.openxmlformats.org/drawingml/2006/picture">
                 <pic:pic>
                   <pic:nvPicPr>
-                    <pic:cNvPr id="0" name="image2.jpg"/>
+                    <pic:cNvPr id="0" name="image1.jpg"/>
                     <pic:cNvPicPr preferRelativeResize="0"/>
                   </pic:nvPicPr>
                   <pic:blipFill>

</xml_diff>